<commit_message>
Reemplaza 'triangulacion' por 'contraste de fuentes' en los documentos
</commit_message>
<xml_diff>
--- a/Informe-Final-Practica-CIE.docx
+++ b/Informe-Final-Practica-CIE.docx
@@ -158,7 +158,7 @@
           <w:b w:val="0"/>
           <w:i w:val="0"/>
         </w:rPr>
-        <w:t>El presente trabajo, desarrollado en la modalidad de práctica profesional, tuvo como propósito diseñar una ruta institucional de emprendimiento que articule el Centro de Innovación y Emprendimiento (CIE) con las facultades de la Universidad del Atlántico, con el fin de incentivar y fortalecer el espíritu emprendedor de la comunidad universitaria. El estudio se enmarca en un enfoque aplicado, de alcance descriptivo–propositivo y metodología mixta, que combinó revisión documental, benchmarking de referentes nacionales y regionales, consultas a actores del ecosistema y la aplicación de dos encuestas: una a estudiantes y egresados (n=106) y otra a docentes (n=10). El diagnóstico evidenció que, si bien el 87,7 % de los estudiantes manifiesta interés en emprender, el 67 % conoce poco o nada el CIE y el 54,7 % no se ha acercado por desconocer sus servicios; a su vez, los docentes identificaron la débil articulación entre facultades y el CIE como la principal dificultad (60 %) y valoraron con 4,2/5 la pertinencia de crear una ruta institucional. Estos hallazgos, triangulados con las consultas internas y externas, confirmaron que el problema no radica en la falta de motivación, sino en la baja visibilidad, el acceso limitado y la escasa articulación. Como resultado, se diseñó una ruta compuesta por seis fases secuenciales organizadas por nivel de madurez —sensibilización; identificación e ideación; diagnóstico y clasificación; formación y preincubación; incubación y fortalecimiento; y aceleración, financiación y transferencia— acompañadas por dos componentes transversales de difusión y de seguimiento y articulación. La propuesta se fundamenta en el Plan de Desarrollo Institucional 2022–2031 (Universidad del Atlántico, 2022) y en referentes como MacondoLab, la Universidad de los Andes y Ruta N, y constituye un instrumento de gestión replicable para consolidar el ecosistema emprendedor de la institución.</w:t>
+        <w:t>El presente trabajo, desarrollado en la modalidad de práctica profesional, tuvo como propósito diseñar una ruta institucional de emprendimiento que articule el Centro de Innovación y Emprendimiento (CIE) con las facultades de la Universidad del Atlántico, con el fin de incentivar y fortalecer el espíritu emprendedor de la comunidad universitaria. El estudio se enmarca en un enfoque aplicado, de alcance descriptivo–propositivo y metodología mixta, que combinó revisión documental, benchmarking de referentes nacionales y regionales, consultas a actores del ecosistema y la aplicación de dos encuestas: una a estudiantes y egresados (n=106) y otra a docentes (n=10). El diagnóstico evidenció que, si bien el 87,7 % de los estudiantes manifiesta interés en emprender, el 67 % conoce poco o nada el CIE y el 54,7 % no se ha acercado por desconocer sus servicios; a su vez, los docentes identificaron la débil articulación entre facultades y el CIE como la principal dificultad (60 %) y valoraron con 4,2/5 la pertinencia de crear una ruta institucional. Estos hallazgos, contrastados con las consultas internas y externas, confirmaron que el problema no radica en la falta de motivación, sino en la baja visibilidad, el acceso limitado y la escasa articulación. Como resultado, se diseñó una ruta compuesta por seis fases secuenciales organizadas por nivel de madurez —sensibilización; identificación e ideación; diagnóstico y clasificación; formación y preincubación; incubación y fortalecimiento; y aceleración, financiación y transferencia— acompañadas por dos componentes transversales de difusión y de seguimiento y articulación. La propuesta se fundamenta en el Plan de Desarrollo Institucional 2022–2031 (Universidad del Atlántico, 2022) y en referentes como MacondoLab, la Universidad de los Andes y Ruta N, y constituye un instrumento de gestión replicable para consolidar el ecosistema emprendedor de la institución.</w:t>
       </w:r>
     </w:p>
     <w:p>
@@ -206,7 +206,7 @@
           <w:b w:val="0"/>
           <w:i w:val="0"/>
         </w:rPr>
-        <w:t>This work, carried out under the professional internship modality, aimed to design an institutional entrepreneurship route to connect the Innovation and Entrepreneurship Center (CIE) with the schools of Universidad del Atlántico, in order to encourage and strengthen the entrepreneurial spirit of the university community. The study follows an applied approach, with a descriptive–propositional scope and a mixed methodology that combined document review, benchmarking of national and regional references, consultations with ecosystem stakeholders, and two surveys: one for students and graduates (n=106) and another for professors (n=10). The diagnosis showed that, although 87.7% of students express interest in entrepreneurship, 67% know little or nothing about the CIE and 54.7% have not approached it because they are unaware of its services; professors identified the weak articulation between schools and the CIE as the main difficulty (60%) and rated the relevance of creating an institutional route at 4.2/5. These findings, triangulated with internal and external consultations, confirmed that the problem lies not in a lack of motivation but in low visibility, limited access, and weak articulation. As a result, a route was designed comprising six sequential phases organized by maturity level —awareness; identification and ideation; diagnosis and classification; training and pre-incubation; incubation and strengthening; and acceleration, financing and transfer— supported by two cross-cutting components of communication and of monitoring and articulation. The proposal is grounded in the Institutional Development Plan 2022–2031 (Universidad del Atlántico, 2022) and in references such as MacondoLab, Universidad de los Andes and Ruta N, and constitutes a replicable management instrument to consolidate the institution's entrepreneurial ecosystem.</w:t>
+        <w:t>This work, carried out under the professional internship modality, aimed to design an institutional entrepreneurship route to connect the Innovation and Entrepreneurship Center (CIE) with the schools of Universidad del Atlántico, in order to encourage and strengthen the entrepreneurial spirit of the university community. The study follows an applied approach, with a descriptive–propositional scope and a mixed methodology that combined document review, benchmarking of national and regional references, consultations with ecosystem stakeholders, and two surveys: one for students and graduates (n=106) and another for professors (n=10). The diagnosis showed that, although 87.7% of students express interest in entrepreneurship, 67% know little or nothing about the CIE and 54.7% have not approached it because they are unaware of its services; professors identified the weak articulation between schools and the CIE as the main difficulty (60%) and rated the relevance of creating an institutional route at 4.2/5. These findings, cross-checked against internal and external consultations, confirmed that the problem lies not in a lack of motivation but in low visibility, limited access, and weak articulation. As a result, a route was designed comprising six sequential phases organized by maturity level —awareness; identification and ideation; diagnosis and classification; training and pre-incubation; incubation and strengthening; and acceleration, financing and transfer— supported by two cross-cutting components of communication and of monitoring and articulation. The proposal is grounded in the Institutional Development Plan 2022–2031 (Universidad del Atlántico, 2022) and in references such as MacondoLab, Universidad de los Andes and Ruta N, and constitutes a replicable management instrument to consolidate the institution's entrepreneurial ecosystem.</w:t>
       </w:r>
     </w:p>
     <w:p>
@@ -862,7 +862,7 @@
           <w:b w:val="0"/>
           <w:i w:val="0"/>
         </w:rPr>
-        <w:t xml:space="preserve">A partir de la triangulación de fuentes se identificaron cuatro factores clave. Primero, la </w:t>
+        <w:t xml:space="preserve">A partir del contraste de fuentes se identificaron cuatro factores clave. Primero, la </w:t>
       </w:r>
       <w:r>
         <w:rPr>

</xml_diff>

<commit_message>
Amplia el glosario del informe final (de 13 a 35 terminos)
</commit_message>
<xml_diff>
--- a/Informe-Final-Practica-CIE.docx
+++ b/Informe-Final-Practica-CIE.docx
@@ -2423,10 +2423,42 @@
           <w:b/>
           <w:color w:val="1E3B7D"/>
         </w:rPr>
+        <w:t xml:space="preserve">Aceleradora: </w:t>
+      </w:r>
+      <w:r>
+        <w:t>Organización que impulsa el crecimiento rápido de emprendimientos ya validados mediante mentoría, red de contactos e inversión.</w:t>
+      </w:r>
+    </w:p>
+    <w:p>
+      <w:pPr>
+        <w:spacing w:after="80"/>
+        <w:jc w:val="both"/>
+      </w:pPr>
+      <w:r>
+        <w:rPr>
+          <w:b/>
+          <w:color w:val="1E3B7D"/>
+        </w:rPr>
         <w:t xml:space="preserve">Benchmarking: </w:t>
       </w:r>
       <w:r>
         <w:t>Análisis comparativo de referentes para identificar buenas prácticas aplicables.</w:t>
+      </w:r>
+    </w:p>
+    <w:p>
+      <w:pPr>
+        <w:spacing w:after="80"/>
+        <w:jc w:val="both"/>
+      </w:pPr>
+      <w:r>
+        <w:rPr>
+          <w:b/>
+          <w:color w:val="1E3B7D"/>
+        </w:rPr>
+        <w:t xml:space="preserve">Branding: </w:t>
+      </w:r>
+      <w:r>
+        <w:t>Construcción y gestión de la identidad y la imagen de una marca.</w:t>
       </w:r>
     </w:p>
     <w:p>
@@ -2455,10 +2487,42 @@
           <w:b/>
           <w:color w:val="1E3B7D"/>
         </w:rPr>
+        <w:t xml:space="preserve">Capital semilla: </w:t>
+      </w:r>
+      <w:r>
+        <w:t>Primera financiación que recibe un emprendimiento para iniciar o validar su operación.</w:t>
+      </w:r>
+    </w:p>
+    <w:p>
+      <w:pPr>
+        <w:spacing w:after="80"/>
+        <w:jc w:val="both"/>
+      </w:pPr>
+      <w:r>
+        <w:rPr>
+          <w:b/>
+          <w:color w:val="1E3B7D"/>
+        </w:rPr>
         <w:t xml:space="preserve">CIE: </w:t>
       </w:r>
       <w:r>
         <w:t>Centro de Innovación y Emprendimiento de la Universidad del Atlántico.</w:t>
+      </w:r>
+    </w:p>
+    <w:p>
+      <w:pPr>
+        <w:spacing w:after="80"/>
+        <w:jc w:val="both"/>
+      </w:pPr>
+      <w:r>
+        <w:rPr>
+          <w:b/>
+          <w:color w:val="1E3B7D"/>
+        </w:rPr>
+        <w:t xml:space="preserve">Coworking: </w:t>
+      </w:r>
+      <w:r>
+        <w:t>Espacio de trabajo compartido que favorece la colaboración y el intercambio entre emprendedores.</w:t>
       </w:r>
     </w:p>
     <w:p>
@@ -2487,10 +2551,74 @@
           <w:b/>
           <w:color w:val="1E3B7D"/>
         </w:rPr>
+        <w:t xml:space="preserve">DOFA: </w:t>
+      </w:r>
+      <w:r>
+        <w:t>Herramienta de diagnóstico estratégico que analiza Debilidades, Oportunidades, Fortalezas y Amenazas.</w:t>
+      </w:r>
+    </w:p>
+    <w:p>
+      <w:pPr>
+        <w:spacing w:after="80"/>
+        <w:jc w:val="both"/>
+      </w:pPr>
+      <w:r>
+        <w:rPr>
+          <w:b/>
+          <w:color w:val="1E3B7D"/>
+        </w:rPr>
+        <w:t xml:space="preserve">Docente enlace: </w:t>
+      </w:r>
+      <w:r>
+        <w:t>Profesor designado en cada facultad como punto de contacto y articulación con el CIE.</w:t>
+      </w:r>
+    </w:p>
+    <w:p>
+      <w:pPr>
+        <w:spacing w:after="80"/>
+        <w:jc w:val="both"/>
+      </w:pPr>
+      <w:r>
+        <w:rPr>
+          <w:b/>
+          <w:color w:val="1E3B7D"/>
+        </w:rPr>
         <w:t xml:space="preserve">Ecosistema emprendedor: </w:t>
       </w:r>
       <w:r>
         <w:t>Conjunto de actores (academia, empresa, Estado, sociedad) que interactúan para apoyar el emprendimiento.</w:t>
+      </w:r>
+    </w:p>
+    <w:p>
+      <w:pPr>
+        <w:spacing w:after="80"/>
+        <w:jc w:val="both"/>
+      </w:pPr>
+      <w:r>
+        <w:rPr>
+          <w:b/>
+          <w:color w:val="1E3B7D"/>
+        </w:rPr>
+        <w:t xml:space="preserve">Emprendimiento: </w:t>
+      </w:r>
+      <w:r>
+        <w:t>Proceso de crear y desarrollar una iniciativa o empresa a partir de una idea, asumiendo riesgos.</w:t>
+      </w:r>
+    </w:p>
+    <w:p>
+      <w:pPr>
+        <w:spacing w:after="80"/>
+        <w:jc w:val="both"/>
+      </w:pPr>
+      <w:r>
+        <w:rPr>
+          <w:b/>
+          <w:color w:val="1E3B7D"/>
+        </w:rPr>
+        <w:t xml:space="preserve">Ideación: </w:t>
+      </w:r>
+      <w:r>
+        <w:t>Fase de generación y estructuración inicial de ideas de negocio.</w:t>
       </w:r>
     </w:p>
     <w:p>
@@ -2519,10 +2647,90 @@
           <w:b/>
           <w:color w:val="1E3B7D"/>
         </w:rPr>
+        <w:t xml:space="preserve">Innovación: </w:t>
+      </w:r>
+      <w:r>
+        <w:t>Introducción de un producto, servicio o proceso nuevo o significativamente mejorado que genera valor.</w:t>
+      </w:r>
+    </w:p>
+    <w:p>
+      <w:pPr>
+        <w:spacing w:after="80"/>
+        <w:jc w:val="both"/>
+      </w:pPr>
+      <w:r>
+        <w:rPr>
+          <w:b/>
+          <w:color w:val="1E3B7D"/>
+        </w:rPr>
+        <w:t xml:space="preserve">Lean Startup: </w:t>
+      </w:r>
+      <w:r>
+        <w:t>Metodología para crear empresas mediante ciclos rápidos de construir–medir–aprender con mínima inversión inicial.</w:t>
+      </w:r>
+    </w:p>
+    <w:p>
+      <w:pPr>
+        <w:spacing w:after="80"/>
+        <w:jc w:val="both"/>
+      </w:pPr>
+      <w:r>
+        <w:rPr>
+          <w:b/>
+          <w:color w:val="1E3B7D"/>
+        </w:rPr>
+        <w:t xml:space="preserve">Mentoría: </w:t>
+      </w:r>
+      <w:r>
+        <w:t>Acompañamiento de una persona con experiencia (mentor) a un emprendedor para orientar su proyecto.</w:t>
+      </w:r>
+    </w:p>
+    <w:p>
+      <w:pPr>
+        <w:spacing w:after="80"/>
+        <w:jc w:val="both"/>
+      </w:pPr>
+      <w:r>
+        <w:rPr>
+          <w:b/>
+          <w:color w:val="1E3B7D"/>
+        </w:rPr>
+        <w:t xml:space="preserve">Modelo de negocio: </w:t>
+      </w:r>
+      <w:r>
+        <w:t>Forma en que una organización crea, entrega y captura valor.</w:t>
+      </w:r>
+    </w:p>
+    <w:p>
+      <w:pPr>
+        <w:spacing w:after="80"/>
+        <w:jc w:val="both"/>
+      </w:pPr>
+      <w:r>
+        <w:rPr>
+          <w:b/>
+          <w:color w:val="1E3B7D"/>
+        </w:rPr>
         <w:t xml:space="preserve">MVP (Producto Mínimo Viable): </w:t>
       </w:r>
       <w:r>
         <w:t>Versión simple de un producto o servicio para validar la propuesta con usuarios reales.</w:t>
+      </w:r>
+    </w:p>
+    <w:p>
+      <w:pPr>
+        <w:spacing w:after="80"/>
+        <w:jc w:val="both"/>
+      </w:pPr>
+      <w:r>
+        <w:rPr>
+          <w:b/>
+          <w:color w:val="1E3B7D"/>
+        </w:rPr>
+        <w:t xml:space="preserve">Networking: </w:t>
+      </w:r>
+      <w:r>
+        <w:t>Creación y aprovechamiento de una red de contactos profesionales.</w:t>
       </w:r>
     </w:p>
     <w:p>
@@ -2567,10 +2775,122 @@
           <w:b/>
           <w:color w:val="1E3B7D"/>
         </w:rPr>
+        <w:t xml:space="preserve">Preincubación: </w:t>
+      </w:r>
+      <w:r>
+        <w:t>Etapa previa a la incubación en la que se estructura y valida la idea de negocio.</w:t>
+      </w:r>
+    </w:p>
+    <w:p>
+      <w:pPr>
+        <w:spacing w:after="80"/>
+        <w:jc w:val="both"/>
+      </w:pPr>
+      <w:r>
+        <w:rPr>
+          <w:b/>
+          <w:color w:val="1E3B7D"/>
+        </w:rPr>
+        <w:t xml:space="preserve">Propiedad intelectual (PI): </w:t>
+      </w:r>
+      <w:r>
+        <w:t>Conjunto de derechos sobre creaciones del intelecto, como patentes, marcas y derechos de autor.</w:t>
+      </w:r>
+    </w:p>
+    <w:p>
+      <w:pPr>
+        <w:spacing w:after="80"/>
+        <w:jc w:val="both"/>
+      </w:pPr>
+      <w:r>
+        <w:rPr>
+          <w:b/>
+          <w:color w:val="1E3B7D"/>
+        </w:rPr>
+        <w:t xml:space="preserve">Prototipo: </w:t>
+      </w:r>
+      <w:r>
+        <w:t>Versión preliminar de un producto que permite probar y validar su funcionamiento.</w:t>
+      </w:r>
+    </w:p>
+    <w:p>
+      <w:pPr>
+        <w:spacing w:after="80"/>
+        <w:jc w:val="both"/>
+      </w:pPr>
+      <w:r>
+        <w:rPr>
+          <w:b/>
+          <w:color w:val="1E3B7D"/>
+        </w:rPr>
+        <w:t xml:space="preserve">PTC (Parque Tecnológico del Caribe): </w:t>
+      </w:r>
+      <w:r>
+        <w:t>Infraestructura regional para el desarrollo de emprendimientos de base tecnológica e innovación.</w:t>
+      </w:r>
+    </w:p>
+    <w:p>
+      <w:pPr>
+        <w:spacing w:after="80"/>
+        <w:jc w:val="both"/>
+      </w:pPr>
+      <w:r>
+        <w:rPr>
+          <w:b/>
+          <w:color w:val="1E3B7D"/>
+        </w:rPr>
+        <w:t xml:space="preserve">Semillero de investigación: </w:t>
+      </w:r>
+      <w:r>
+        <w:t>Grupo de estudiantes y docentes que desarrollan investigación e iniciativas de innovación.</w:t>
+      </w:r>
+    </w:p>
+    <w:p>
+      <w:pPr>
+        <w:spacing w:after="80"/>
+        <w:jc w:val="both"/>
+      </w:pPr>
+      <w:r>
+        <w:rPr>
+          <w:b/>
+          <w:color w:val="1E3B7D"/>
+        </w:rPr>
+        <w:t xml:space="preserve">Sensibilización: </w:t>
+      </w:r>
+      <w:r>
+        <w:t>Acciones orientadas a despertar el interés y la cultura emprendedora en la comunidad.</w:t>
+      </w:r>
+    </w:p>
+    <w:p>
+      <w:pPr>
+        <w:spacing w:after="80"/>
+        <w:jc w:val="both"/>
+      </w:pPr>
+      <w:r>
+        <w:rPr>
+          <w:b/>
+          <w:color w:val="1E3B7D"/>
+        </w:rPr>
         <w:t xml:space="preserve">Spin-off: </w:t>
       </w:r>
       <w:r>
         <w:t>Empresa derivada de resultados de investigación científica o tecnológica.</w:t>
+      </w:r>
+    </w:p>
+    <w:p>
+      <w:pPr>
+        <w:spacing w:after="80"/>
+        <w:jc w:val="both"/>
+      </w:pPr>
+      <w:r>
+        <w:rPr>
+          <w:b/>
+          <w:color w:val="1E3B7D"/>
+        </w:rPr>
+        <w:t xml:space="preserve">Startup: </w:t>
+      </w:r>
+      <w:r>
+        <w:t>Empresa emergente, con frecuencia de base tecnológica, con alto potencial de crecimiento.</w:t>
       </w:r>
     </w:p>
     <w:p>
@@ -2603,6 +2923,38 @@
       </w:r>
       <w:r>
         <w:t>Proceso de llevar el conocimiento generado en la universidad al sector productivo y social.</w:t>
+      </w:r>
+    </w:p>
+    <w:p>
+      <w:pPr>
+        <w:spacing w:after="80"/>
+        <w:jc w:val="both"/>
+      </w:pPr>
+      <w:r>
+        <w:rPr>
+          <w:b/>
+          <w:color w:val="1E3B7D"/>
+        </w:rPr>
+        <w:t xml:space="preserve">Transformación digital: </w:t>
+      </w:r>
+      <w:r>
+        <w:t>Incorporación de tecnologías digitales en los procesos y en el modelo de negocio de una organización.</w:t>
+      </w:r>
+    </w:p>
+    <w:p>
+      <w:pPr>
+        <w:spacing w:after="80"/>
+        <w:jc w:val="both"/>
+      </w:pPr>
+      <w:r>
+        <w:rPr>
+          <w:b/>
+          <w:color w:val="1E3B7D"/>
+        </w:rPr>
+        <w:t xml:space="preserve">Validación: </w:t>
+      </w:r>
+      <w:r>
+        <w:t>Proceso de comprobar con usuarios reales que una propuesta resuelve una necesidad.</w:t>
       </w:r>
     </w:p>
     <w:p>

</xml_diff>

<commit_message>
Cambios estructurales informe final: organigrama oficial, historia CIE, percepcion, graficos por figura, anexos 1-7 y ruta con 3 transversales
</commit_message>
<xml_diff>
--- a/Informe-Final-Practica-CIE.docx
+++ b/Informe-Final-Practica-CIE.docx
@@ -683,7 +683,7 @@
         <w:pStyle w:val="Heading2"/>
       </w:pPr>
       <w:r>
-        <w:t>3.1 Contexto de la Vicerrectoría de Investigación, Extensión y Proyección Social y la percepción del emprendimiento</w:t>
+        <w:t>3.1 Contexto de la Vicerrectoría de Investigaciones, Extensión y Proyección Social y la percepción del emprendimiento</w:t>
       </w:r>
     </w:p>
     <w:p>
@@ -696,7 +696,7 @@
           <w:b w:val="0"/>
           <w:i w:val="0"/>
         </w:rPr>
-        <w:t>El CIE se ubica en el Departamento de Extensión y Proyección Social, adscrito a la Vicerrectoría de Investigaciones, Extensión y Proyección Social, unidad encargada de articular la relación entre la universidad y su entorno (Universidad del Atlántico, 2022). La Figura 1 presenta esta estructura y el lugar de la ruta dentro de ella.</w:t>
+        <w:t>El CIE se enmarca dentro de la estructura orgánica de la Universidad del Atlántico. Como se aprecia en el organigrama institucional (Figura 1), el Centro se ubica en el Departamento de Extensión y Proyección Social, adscrito a la Vicerrectoría de Investigaciones, Extensión y Proyección Social, unidad encargada de articular la relación entre la Universidad y su entorno (Universidad del Atlántico, 2026).</w:t>
       </w:r>
     </w:p>
     <w:p>
@@ -706,7 +706,7 @@
       <w:r>
         <w:drawing>
           <wp:inline xmlns:a="http://schemas.openxmlformats.org/drawingml/2006/main" xmlns:pic="http://schemas.openxmlformats.org/drawingml/2006/picture">
-            <wp:extent cx="4389120" cy="2722366"/>
+            <wp:extent cx="5760720" cy="3580509"/>
             <wp:docPr id="1" name="Picture 1"/>
             <wp:cNvGraphicFramePr>
               <a:graphicFrameLocks noChangeAspect="1"/>
@@ -715,7 +715,7 @@
               <a:graphicData uri="http://schemas.openxmlformats.org/drawingml/2006/picture">
                 <pic:pic>
                   <pic:nvPicPr>
-                    <pic:cNvPr id="0" name="organigrama.png"/>
+                    <pic:cNvPr id="0" name="organigrama_oficial.png"/>
                     <pic:cNvPicPr/>
                   </pic:nvPicPr>
                   <pic:blipFill>
@@ -727,7 +727,7 @@
                   <pic:spPr>
                     <a:xfrm>
                       <a:off x="0" y="0"/>
-                      <a:ext cx="4389120" cy="2722366"/>
+                      <a:ext cx="5760720" cy="3580509"/>
                     </a:xfrm>
                     <a:prstGeom prst="rect"/>
                   </pic:spPr>
@@ -762,7 +762,7 @@
           <w:color w:val="595959"/>
           <w:sz w:val="18"/>
         </w:rPr>
-        <w:t>. Ubicación institucional del CIE y de la ruta de emprendimiento.</w:t>
+        <w:t>. Organigrama institucional de la Universidad del Atlántico. Fuente: Universidad del Atlántico (2026).</w:t>
       </w:r>
     </w:p>
     <w:p>
@@ -775,7 +775,20 @@
           <w:b w:val="0"/>
           <w:i w:val="0"/>
         </w:rPr>
-        <w:t>En cuanto a la percepción de la comunidad, la encuesta aplicada a estudiantes y egresados (n=106) evidenció una brecha significativa: pese a que el 87,7 % manifiesta algún grado de interés o actividad emprendedora, el 67 % declara conocer poco o nada el CIE (Figura 2). Esta baja apropiación coincide con lo planteado por Saavedra-García et al. (2025) sobre la necesidad de potenciar la intención emprendedora mediante estrategias y seguimiento claros.</w:t>
+        <w:t>El Centro de Innovación y Emprendimiento es una unidad de creación reciente dentro de la Universidad. Su surgimiento y consolidación responden al mandato del Plan de Desarrollo Institucional 2022–2031, que ordena crear y fortalecer el ecosistema de innovación y emprendimiento —bajo la iniciativa institucional «UA Emprende»—, así como a la reestructuración orgánica de la institución (Universidad del Atlántico, 2022). Por su corta trayectoria, el CIE se encuentra aún en una etapa de estructuración de sus procesos y servicios, lo que explica tanto su gran potencial como los retos de visibilidad, articulación y consolidación que este trabajo busca atender.</w:t>
+      </w:r>
+    </w:p>
+    <w:p>
+      <w:pPr>
+        <w:spacing w:after="120" w:before="0"/>
+        <w:jc w:val="both"/>
+      </w:pPr>
+      <w:r>
+        <w:rPr>
+          <w:b w:val="0"/>
+          <w:i w:val="0"/>
+        </w:rPr>
+        <w:t>El diseño de una ruta pertinente exige, en primer lugar, comprender cómo percibe la comunidad universitaria el emprendimiento y al propio CIE. Medir la percepción es importante porque permite conocer la brecha entre la oferta institucional y su apropiación real: revela qué tan visible es el Centro, qué barreras encuentran las personas para acercarse y qué esperan del acompañamiento. Sin este diagnóstico, cualquier ruta correría el riesgo de responder a supuestos y no a necesidades reales. Con ese propósito se aplicó una encuesta a estudiantes y egresados (n=106), que evidenció una brecha significativa: pese a que el 87,7 % manifiesta algún grado de interés o actividad emprendedora, el 67 % declara conocer poco o nada el CIE (Figura 2). Esta baja apropiación coincide con lo planteado por Saavedra-García et al. (2025) sobre la necesidad de potenciar la intención emprendedora mediante estrategias y seguimiento claros.</w:t>
       </w:r>
     </w:p>
     <w:p>
@@ -842,6 +855,85 @@
           <w:sz w:val="18"/>
         </w:rPr>
         <w:t>. Nivel de conocimiento del CIE (encuesta a estudiantes, n=106).</w:t>
+      </w:r>
+    </w:p>
+    <w:p>
+      <w:pPr>
+        <w:spacing w:after="120" w:before="0"/>
+        <w:jc w:val="both"/>
+      </w:pPr>
+      <w:r>
+        <w:rPr>
+          <w:b w:val="0"/>
+          <w:i w:val="0"/>
+        </w:rPr>
+        <w:t>La percepción estudiantil se complementó con una consulta a docentes (n=10). A diferencia de la encuesta a estudiantes, esta fue deliberadamente específica y dirigida: se aplicó principalmente a profesores de la Facultad de Ciencias Económicas que ya venían adelantando trabajos y procesos relacionados con el emprendimiento. Se optó por esta focalización porque el objetivo no era obtener una muestra general, sino una lectura cualificada por parte de actores con conocimiento directo del tema y de la relación entre las facultades y el CIE. El resultado fue contundente: los docentes señalaron la débil articulación entre las facultades y el CIE como la principal dificultad para fortalecer el emprendimiento (60 %) (Figura 3), lo que confirma —desde la mirada docente— uno de los factores más críticos del problema.</w:t>
+      </w:r>
+    </w:p>
+    <w:p>
+      <w:pPr>
+        <w:jc w:val="center"/>
+      </w:pPr>
+      <w:r>
+        <w:drawing>
+          <wp:inline xmlns:a="http://schemas.openxmlformats.org/drawingml/2006/main" xmlns:pic="http://schemas.openxmlformats.org/drawingml/2006/picture">
+            <wp:extent cx="4937760" cy="2516142"/>
+            <wp:docPr id="3" name="Picture 3"/>
+            <wp:cNvGraphicFramePr>
+              <a:graphicFrameLocks noChangeAspect="1"/>
+            </wp:cNvGraphicFramePr>
+            <a:graphic>
+              <a:graphicData uri="http://schemas.openxmlformats.org/drawingml/2006/picture">
+                <pic:pic>
+                  <pic:nvPicPr>
+                    <pic:cNvPr id="0" name="docentes_dificultades.png"/>
+                    <pic:cNvPicPr/>
+                  </pic:nvPicPr>
+                  <pic:blipFill>
+                    <a:blip r:embed="rId12"/>
+                    <a:stretch>
+                      <a:fillRect/>
+                    </a:stretch>
+                  </pic:blipFill>
+                  <pic:spPr>
+                    <a:xfrm>
+                      <a:off x="0" y="0"/>
+                      <a:ext cx="4937760" cy="2516142"/>
+                    </a:xfrm>
+                    <a:prstGeom prst="rect"/>
+                  </pic:spPr>
+                </pic:pic>
+              </a:graphicData>
+            </a:graphic>
+          </wp:inline>
+        </w:drawing>
+      </w:r>
+    </w:p>
+    <w:p>
+      <w:pPr>
+        <w:spacing w:after="200"/>
+        <w:jc w:val="center"/>
+      </w:pPr>
+      <w:r>
+        <w:rPr>
+          <w:i/>
+          <w:color w:val="595959"/>
+          <w:sz w:val="18"/>
+        </w:rPr>
+        <w:t xml:space="preserve">Figura </w:t>
+      </w:r>
+      <w:fldSimple w:instr=" SEQ Figura \* ARABIC ">
+        <w:r>
+          <w:t>1</w:t>
+        </w:r>
+      </w:fldSimple>
+      <w:r>
+        <w:rPr>
+          <w:i/>
+          <w:color w:val="595959"/>
+          <w:sz w:val="18"/>
+        </w:rPr>
+        <w:t>. Principales dificultades para fortalecer el emprendimiento según los docentes (n=10).</w:t>
       </w:r>
     </w:p>
     <w:p>
@@ -1208,18 +1300,31 @@
           <w:b w:val="0"/>
           <w:i w:val="0"/>
         </w:rPr>
-        <w:t>Los resultados de la encuesta a estudiantes matizan el panorama. Frente a su situación emprendedora, el 46,2 % manifiesta interés sin una idea definida, el 26,4 % tiene una idea, el 15,1 % un emprendimiento en marcha y el 12,3 % no tiene interés (Figura 3). Las afirmaciones valorativas muestran una actitud favorable —el emprendimiento como opción real de desarrollo alcanzó 4,26/5— (Figura 4), mientras que la principal razón para no acercarse al CIE es el desconocimiento de los servicios (Figura 5). En cuanto a la demanda, los apoyos más solicitados son la asesoría en modelo de negocio (62,3 %), la educación financiera (50 %) y el marketing (49,1 %) (Figura 6), y los canales preferidos son el correo institucional y WhatsApp (Figura 7).</w:t>
+        <w:t>Los resultados de la encuesta a estudiantes y egresados matizan y profundizan el panorama. A continuación se presentan los principales hallazgos, cada uno acompañado de la figura correspondiente.</w:t>
       </w:r>
     </w:p>
     <w:p>
       <w:pPr>
+        <w:spacing w:after="120" w:before="0"/>
+        <w:jc w:val="both"/>
+      </w:pPr>
+      <w:r>
+        <w:rPr>
+          <w:b w:val="0"/>
+          <w:i w:val="0"/>
+        </w:rPr>
+        <w:t>En primer lugar, respecto a la situación emprendedora de los encuestados, el 46,2 % manifiesta interés en emprender aunque todavía no tiene una idea definida, el 26,4 % ya cuenta con una idea, el 15,1 % tiene un emprendimiento en marcha y solo el 12,3 % declara no tener interés (Figura 4). Esto revela que la gran mayoría de la comunidad estudiantil se encuentra en etapas tempranas del proceso emprendedor —justamente donde el acompañamiento del CIE resulta más determinante—.</w:t>
+      </w:r>
+    </w:p>
+    <w:p>
+      <w:pPr>
         <w:jc w:val="center"/>
       </w:pPr>
       <w:r>
         <w:drawing>
           <wp:inline xmlns:a="http://schemas.openxmlformats.org/drawingml/2006/main" xmlns:pic="http://schemas.openxmlformats.org/drawingml/2006/picture">
-            <wp:extent cx="4389120" cy="2753763"/>
-            <wp:docPr id="3" name="Picture 3"/>
+            <wp:extent cx="4572000" cy="2868503"/>
+            <wp:docPr id="4" name="Picture 4"/>
             <wp:cNvGraphicFramePr>
               <a:graphicFrameLocks noChangeAspect="1"/>
             </wp:cNvGraphicFramePr>
@@ -1231,7 +1336,7 @@
                     <pic:cNvPicPr/>
                   </pic:nvPicPr>
                   <pic:blipFill>
-                    <a:blip r:embed="rId12"/>
+                    <a:blip r:embed="rId13"/>
                     <a:stretch>
                       <a:fillRect/>
                     </a:stretch>
@@ -1239,7 +1344,7 @@
                   <pic:spPr>
                     <a:xfrm>
                       <a:off x="0" y="0"/>
-                      <a:ext cx="4389120" cy="2753763"/>
+                      <a:ext cx="4572000" cy="2868503"/>
                     </a:xfrm>
                     <a:prstGeom prst="rect"/>
                   </pic:spPr>
@@ -1274,7 +1379,20 @@
           <w:color w:val="595959"/>
           <w:sz w:val="18"/>
         </w:rPr>
-        <w:t>. Situación de los estudiantes frente al emprendimiento.</w:t>
+        <w:t>. Situación de los estudiantes frente al emprendimiento (n=106).</w:t>
+      </w:r>
+    </w:p>
+    <w:p>
+      <w:pPr>
+        <w:spacing w:after="120" w:before="0"/>
+        <w:jc w:val="both"/>
+      </w:pPr>
+      <w:r>
+        <w:rPr>
+          <w:b w:val="0"/>
+          <w:i w:val="0"/>
+        </w:rPr>
+        <w:t>En cuanto a las actitudes hacia el emprendimiento, las afirmaciones valorativas reflejan una disposición favorable: la idea del emprendimiento como una opción real de desarrollo profesional alcanzó un promedio de 4,26/5, uno de los valores más altos de la encuesta (Figura 5). Existe, por tanto, una base actitudinal positiva sobre la cual construir la ruta.</w:t>
       </w:r>
     </w:p>
     <w:p>
@@ -1285,7 +1403,7 @@
         <w:drawing>
           <wp:inline xmlns:a="http://schemas.openxmlformats.org/drawingml/2006/main" xmlns:pic="http://schemas.openxmlformats.org/drawingml/2006/picture">
             <wp:extent cx="4754880" cy="2352025"/>
-            <wp:docPr id="4" name="Picture 4"/>
+            <wp:docPr id="5" name="Picture 5"/>
             <wp:cNvGraphicFramePr>
               <a:graphicFrameLocks noChangeAspect="1"/>
             </wp:cNvGraphicFramePr>
@@ -1297,7 +1415,7 @@
                     <pic:cNvPicPr/>
                   </pic:nvPicPr>
                   <pic:blipFill>
-                    <a:blip r:embed="rId13"/>
+                    <a:blip r:embed="rId14"/>
                     <a:stretch>
                       <a:fillRect/>
                     </a:stretch>
@@ -1340,7 +1458,20 @@
           <w:color w:val="595959"/>
           <w:sz w:val="18"/>
         </w:rPr>
-        <w:t>. Nivel de acuerdo con afirmaciones sobre emprendimiento (estudiantes).</w:t>
+        <w:t>. Nivel de acuerdo con afirmaciones sobre el emprendimiento (estudiantes, n=106).</w:t>
+      </w:r>
+    </w:p>
+    <w:p>
+      <w:pPr>
+        <w:spacing w:after="120" w:before="0"/>
+        <w:jc w:val="both"/>
+      </w:pPr>
+      <w:r>
+        <w:rPr>
+          <w:b w:val="0"/>
+          <w:i w:val="0"/>
+        </w:rPr>
+        <w:t>No obstante, ese interés no se traduce en un acercamiento al Centro. La principal razón para no aproximarse al CIE es el desconocimiento de los servicios que ofrece, seguida de no saber cómo acceder a ellos (Figura 6). La barrera, por tanto, no es de motivación sino de información y visibilidad, lo que refuerza el diagnóstico del problema.</w:t>
       </w:r>
     </w:p>
     <w:p>
@@ -1351,7 +1482,7 @@
         <w:drawing>
           <wp:inline xmlns:a="http://schemas.openxmlformats.org/drawingml/2006/main" xmlns:pic="http://schemas.openxmlformats.org/drawingml/2006/picture">
             <wp:extent cx="4937760" cy="2791531"/>
-            <wp:docPr id="5" name="Picture 5"/>
+            <wp:docPr id="6" name="Picture 6"/>
             <wp:cNvGraphicFramePr>
               <a:graphicFrameLocks noChangeAspect="1"/>
             </wp:cNvGraphicFramePr>
@@ -1363,7 +1494,7 @@
                     <pic:cNvPicPr/>
                   </pic:nvPicPr>
                   <pic:blipFill>
-                    <a:blip r:embed="rId14"/>
+                    <a:blip r:embed="rId15"/>
                     <a:stretch>
                       <a:fillRect/>
                     </a:stretch>
@@ -1406,7 +1537,20 @@
           <w:color w:val="595959"/>
           <w:sz w:val="18"/>
         </w:rPr>
-        <w:t>. Razones para no acercarse al CIE (estudiantes).</w:t>
+        <w:t>. Razones para no acercarse al CIE (estudiantes, n=106).</w:t>
+      </w:r>
+    </w:p>
+    <w:p>
+      <w:pPr>
+        <w:spacing w:after="120" w:before="0"/>
+        <w:jc w:val="both"/>
+      </w:pPr>
+      <w:r>
+        <w:rPr>
+          <w:b w:val="0"/>
+          <w:i w:val="0"/>
+        </w:rPr>
+        <w:t>Respecto a la demanda de acompañamiento, los apoyos más solicitados por los estudiantes son la asesoría en modelo de negocio (62,3 %), la educación financiera (50 %) y el marketing (49,1 %) (Figura 7). Estas necesidades constituyen insumos directos para definir los contenidos de las fases de formación y preincubación de la ruta.</w:t>
       </w:r>
     </w:p>
     <w:p>
@@ -1417,7 +1561,7 @@
         <w:drawing>
           <wp:inline xmlns:a="http://schemas.openxmlformats.org/drawingml/2006/main" xmlns:pic="http://schemas.openxmlformats.org/drawingml/2006/picture">
             <wp:extent cx="4937760" cy="2805109"/>
-            <wp:docPr id="6" name="Picture 6"/>
+            <wp:docPr id="7" name="Picture 7"/>
             <wp:cNvGraphicFramePr>
               <a:graphicFrameLocks noChangeAspect="1"/>
             </wp:cNvGraphicFramePr>
@@ -1429,7 +1573,7 @@
                     <pic:cNvPicPr/>
                   </pic:nvPicPr>
                   <pic:blipFill>
-                    <a:blip r:embed="rId15"/>
+                    <a:blip r:embed="rId16"/>
                     <a:stretch>
                       <a:fillRect/>
                     </a:stretch>
@@ -1472,18 +1616,31 @@
           <w:color w:val="595959"/>
           <w:sz w:val="18"/>
         </w:rPr>
-        <w:t>. Tipo de apoyo deseado del CIE (estudiantes).</w:t>
+        <w:t>. Tipo de apoyo deseado del CIE (estudiantes, n=106).</w:t>
       </w:r>
     </w:p>
     <w:p>
       <w:pPr>
+        <w:spacing w:after="120" w:before="0"/>
+        <w:jc w:val="both"/>
+      </w:pPr>
+      <w:r>
+        <w:rPr>
+          <w:b w:val="0"/>
+          <w:i w:val="0"/>
+        </w:rPr>
+        <w:t>Finalmente, en cuanto a los canales de comunicación, los medios preferidos para recibir información son el correo institucional y WhatsApp (Figura 8). Este dato es clave para diseñar la estrategia de difusión, que deberá priorizar dichos canales para superar la baja visibilidad detectada.</w:t>
+      </w:r>
+    </w:p>
+    <w:p>
+      <w:pPr>
         <w:jc w:val="center"/>
       </w:pPr>
       <w:r>
         <w:drawing>
           <wp:inline xmlns:a="http://schemas.openxmlformats.org/drawingml/2006/main" xmlns:pic="http://schemas.openxmlformats.org/drawingml/2006/picture">
-            <wp:extent cx="4389120" cy="2539491"/>
-            <wp:docPr id="7" name="Picture 7"/>
+            <wp:extent cx="4572000" cy="2645303"/>
+            <wp:docPr id="8" name="Picture 8"/>
             <wp:cNvGraphicFramePr>
               <a:graphicFrameLocks noChangeAspect="1"/>
             </wp:cNvGraphicFramePr>
@@ -1495,7 +1652,7 @@
                     <pic:cNvPicPr/>
                   </pic:nvPicPr>
                   <pic:blipFill>
-                    <a:blip r:embed="rId16"/>
+                    <a:blip r:embed="rId17"/>
                     <a:stretch>
                       <a:fillRect/>
                     </a:stretch>
@@ -1503,7 +1660,7 @@
                   <pic:spPr>
                     <a:xfrm>
                       <a:off x="0" y="0"/>
-                      <a:ext cx="4389120" cy="2539491"/>
+                      <a:ext cx="4572000" cy="2645303"/>
                     </a:xfrm>
                     <a:prstGeom prst="rect"/>
                   </pic:spPr>
@@ -1538,7 +1695,7 @@
           <w:color w:val="595959"/>
           <w:sz w:val="18"/>
         </w:rPr>
-        <w:t>. Medio preferido para recibir información (estudiantes).</w:t>
+        <w:t>. Medio preferido para recibir información (estudiantes, n=106).</w:t>
       </w:r>
     </w:p>
     <w:p>
@@ -1551,7 +1708,7 @@
           <w:b w:val="0"/>
           <w:i w:val="0"/>
         </w:rPr>
-        <w:t>La consulta a docentes (n=10) reforzó el diagnóstico: la afirmación mejor valorada fue que una ruta institucional fortalecería el ecosistema (4,2/5), y la principal dificultad señalada fue la falta de articulación entre facultades y el CIE (60 %) (Figuras 8 y 9). Un referente externo, la Corporación MAVI, demostró además que una ruta por etapas en operación es viable y efectiva.</w:t>
+        <w:t>La consulta a docentes (n=10) reforzó el diagnóstico. Además de la débil articulación ya señalada (Figura 3), la afirmación mejor valorada por los docentes fue que la creación de una ruta institucional fortalecería el ecosistema emprendedor, con 4,2/5 —el promedio más alto de su encuesta— (Figura 9). De este modo, los docentes no solo reconocen el problema, sino que avalan directamente la solución propuesta. A ello se suma que un referente externo, la Corporación MAVI, demuestra que una ruta por etapas en operación es viable y efectiva.</w:t>
       </w:r>
     </w:p>
     <w:p>
@@ -1562,7 +1719,7 @@
         <w:drawing>
           <wp:inline xmlns:a="http://schemas.openxmlformats.org/drawingml/2006/main" xmlns:pic="http://schemas.openxmlformats.org/drawingml/2006/picture">
             <wp:extent cx="4937760" cy="2520738"/>
-            <wp:docPr id="8" name="Picture 8"/>
+            <wp:docPr id="9" name="Picture 9"/>
             <wp:cNvGraphicFramePr>
               <a:graphicFrameLocks noChangeAspect="1"/>
             </wp:cNvGraphicFramePr>
@@ -1574,7 +1731,7 @@
                     <pic:cNvPicPr/>
                   </pic:nvPicPr>
                   <pic:blipFill>
-                    <a:blip r:embed="rId17"/>
+                    <a:blip r:embed="rId18"/>
                     <a:stretch>
                       <a:fillRect/>
                     </a:stretch>
@@ -1617,73 +1774,7 @@
           <w:color w:val="595959"/>
           <w:sz w:val="18"/>
         </w:rPr>
-        <w:t>. Nivel de acuerdo de los docentes (n=10).</w:t>
-      </w:r>
-    </w:p>
-    <w:p>
-      <w:pPr>
-        <w:jc w:val="center"/>
-      </w:pPr>
-      <w:r>
-        <w:drawing>
-          <wp:inline xmlns:a="http://schemas.openxmlformats.org/drawingml/2006/main" xmlns:pic="http://schemas.openxmlformats.org/drawingml/2006/picture">
-            <wp:extent cx="4937760" cy="2516142"/>
-            <wp:docPr id="9" name="Picture 9"/>
-            <wp:cNvGraphicFramePr>
-              <a:graphicFrameLocks noChangeAspect="1"/>
-            </wp:cNvGraphicFramePr>
-            <a:graphic>
-              <a:graphicData uri="http://schemas.openxmlformats.org/drawingml/2006/picture">
-                <pic:pic>
-                  <pic:nvPicPr>
-                    <pic:cNvPr id="0" name="docentes_dificultades.png"/>
-                    <pic:cNvPicPr/>
-                  </pic:nvPicPr>
-                  <pic:blipFill>
-                    <a:blip r:embed="rId18"/>
-                    <a:stretch>
-                      <a:fillRect/>
-                    </a:stretch>
-                  </pic:blipFill>
-                  <pic:spPr>
-                    <a:xfrm>
-                      <a:off x="0" y="0"/>
-                      <a:ext cx="4937760" cy="2516142"/>
-                    </a:xfrm>
-                    <a:prstGeom prst="rect"/>
-                  </pic:spPr>
-                </pic:pic>
-              </a:graphicData>
-            </a:graphic>
-          </wp:inline>
-        </w:drawing>
-      </w:r>
-    </w:p>
-    <w:p>
-      <w:pPr>
-        <w:spacing w:after="200"/>
-        <w:jc w:val="center"/>
-      </w:pPr>
-      <w:r>
-        <w:rPr>
-          <w:i/>
-          <w:color w:val="595959"/>
-          <w:sz w:val="18"/>
-        </w:rPr>
-        <w:t xml:space="preserve">Figura </w:t>
-      </w:r>
-      <w:fldSimple w:instr=" SEQ Figura \* ARABIC ">
-        <w:r>
-          <w:t>1</w:t>
-        </w:r>
-      </w:fldSimple>
-      <w:r>
-        <w:rPr>
-          <w:i/>
-          <w:color w:val="595959"/>
-          <w:sz w:val="18"/>
-        </w:rPr>
-        <w:t>. Principales dificultades según los docentes (n=10).</w:t>
+        <w:t>. Nivel de acuerdo de los docentes con las afirmaciones sobre el emprendimiento (n=10).</w:t>
       </w:r>
     </w:p>
     <w:p>
@@ -1704,7 +1795,7 @@
           <w:b w:val="0"/>
           <w:i w:val="0"/>
         </w:rPr>
-        <w:t>A partir de la evidencia se construyó la matriz DOFA (Tabla 3) y, sobre ella, las estrategias cruzadas (Tabla 4), que orientan el diseño de la ruta.</w:t>
+        <w:t>A partir de la evidencia recolectada se construyó la matriz DOFA (Tabla 3) y, sobre ella, las estrategias cruzadas de tipo FO, DO, FA y DA (Tabla 4), que orientan el diseño de la ruta. Con el fin de no extender el cuerpo del informe, en este apartado se presenta la síntesis; el análisis profundo de cada factor —con su respectiva evidencia y las estrategias cruzadas explicadas en detalle— se desarrolla en un documento independiente que se adjunta como Anexo 4 (Análisis DOFA).</w:t>
       </w:r>
     </w:p>
     <w:p>
@@ -2209,7 +2300,7 @@
           <w:b w:val="0"/>
           <w:i w:val="0"/>
         </w:rPr>
-        <w:t>La ruta se compone de seis fases secuenciales, organizadas por nivel de madurez, y de dos componentes transversales (difusión y comunicación; seguimiento, indicadores y articulación). Su carácter no lineal permite que cada iniciativa ingrese en la fase correspondiente a su estado, siguiendo la lógica de referentes como MacondoLab (s.f.) y la Universidad de los Andes (s.f.). La Figura 10 presenta el esquema general.</w:t>
+        <w:t>La ruta se compone de seis fases secuenciales, organizadas por nivel de madurez, y de tres componentes transversales que acompañan todas las fases: T1. comunicación; T2. seguimiento e indicadores; y T3. articulación con las facultades. Su carácter no lineal permite que cada iniciativa ingrese en la fase correspondiente a su estado, siguiendo la lógica de referentes como MacondoLab (MacondoLab, s.f.) y la Universidad de los Andes (Universidad de los Andes, s.f.). La Figura 10 presenta el esquema general. Para su construcción se realizó un levantamiento de información con instituciones que promueven el emprendimiento y un análisis en detalle de cada fase, con sus responsables e indicadores, que se desarrolla en el documento técnico de la ruta (Anexo 6).</w:t>
       </w:r>
     </w:p>
     <w:p>
@@ -2219,7 +2310,7 @@
       <w:r>
         <w:drawing>
           <wp:inline xmlns:a="http://schemas.openxmlformats.org/drawingml/2006/main" xmlns:pic="http://schemas.openxmlformats.org/drawingml/2006/picture">
-            <wp:extent cx="5852160" cy="2829968"/>
+            <wp:extent cx="5852160" cy="3271372"/>
             <wp:docPr id="10" name="Picture 10"/>
             <wp:cNvGraphicFramePr>
               <a:graphicFrameLocks noChangeAspect="1"/>
@@ -2240,7 +2331,7 @@
                   <pic:spPr>
                     <a:xfrm>
                       <a:off x="0" y="0"/>
-                      <a:ext cx="5852160" cy="2829968"/>
+                      <a:ext cx="5852160" cy="3271372"/>
                     </a:xfrm>
                     <a:prstGeom prst="rect"/>
                   </pic:spPr>
@@ -2372,7 +2463,7 @@
           <w:b w:val="0"/>
           <w:i w:val="0"/>
         </w:rPr>
-        <w:t>, que conecta con convocatorias, capital semilla, propiedad intelectual y aliados como Cientech y el Parque Tecnológico del Caribe. El detalle completo de cada fase, sus responsables e indicadores se presenta en el Anexo No. 4.</w:t>
+        <w:t>, que conecta con convocatorias, capital semilla, propiedad intelectual y aliados como Cientech y el Parque Tecnológico del Caribe. Este contenido se presenta además de forma visual, como instrumento facilitador para la socialización de la ruta, en la guía en formato de presentación que se adjunta como Anexo 7.</w:t>
       </w:r>
     </w:p>
     <w:p>
@@ -2385,7 +2476,7 @@
           <w:b w:val="0"/>
           <w:i w:val="0"/>
         </w:rPr>
-        <w:t>La ruta se articula con las facultades mediante un docente enlace por facultad, la integración curricular del emprendimiento, retos interdisciplinarios y una difusión segmentada por correo institucional y WhatsApp, atendiendo las preferencias evidenciadas en el diagnóstico.</w:t>
+        <w:t>Ahora bien, para que la ruta impacte a toda la comunidad, su implementación se sustenta en un conjunto de estrategias de articulación con las facultades, desarrolladas en detalle en un documento independiente (Anexo 5). Dicha articulación se materializa a través de un docente enlace en cada facultad, la integración curricular progresiva del emprendimiento, la realización de actividades y eventos conjuntos por facultad, y una difusión segmentada por los canales preferidos por la comunidad (correo institucional y WhatsApp), atendiendo las preferencias evidenciadas en el diagnóstico. De este modo, la ruta y las estrategias de articulación operan de forma complementaria: la primera define el «qué» y el «cómo» del acompañamiento, y las segundas aseguran que ese acompañamiento llegue de manera transversal a todas las facultades.</w:t>
       </w:r>
     </w:p>
     <w:p>
@@ -3197,6 +3288,19 @@
         <w:rPr>
           <w:sz w:val="20"/>
         </w:rPr>
+        <w:t>Universidad del Atlántico. (2026). Organigrama institucional. Recuperado de https://www.uniatlantico.edu.co/wp-content/uploads/2026/05/Organigrama-Universidad-del-Atlantico.pdf</w:t>
+      </w:r>
+    </w:p>
+    <w:p>
+      <w:pPr>
+        <w:spacing w:after="120"/>
+        <w:ind w:left="567" w:hanging="567"/>
+        <w:jc w:val="both"/>
+      </w:pPr>
+      <w:r>
+        <w:rPr>
+          <w:sz w:val="20"/>
+        </w:rPr>
         <w:t>Universidad del Norte. (s.f.). Centro de Emprendimiento. Recuperado de https://www.uninorte.edu.co/web/centro-de-emprendimiento</w:t>
       </w:r>
     </w:p>
@@ -3245,7 +3349,7 @@
           <w:b w:val="0"/>
           <w:i w:val="0"/>
         </w:rPr>
-        <w:t>Los anexos se incorporan en documento(s) complementario(s):</w:t>
+        <w:t>La información que amplía y sustenta este informe se incorpora en los siguientes documentos complementarios:</w:t>
       </w:r>
     </w:p>
     <w:p>
@@ -3260,7 +3364,7 @@
           <w:b w:val="0"/>
           <w:sz w:val="22"/>
         </w:rPr>
-        <w:t>Anexo No. 1. Entrevistas (guías de consulta).</w:t>
+        <w:t>Anexo 1. Entrevistas / guías de consulta (CIE y Corporación MAVI).</w:t>
       </w:r>
     </w:p>
     <w:p>
@@ -3275,7 +3379,7 @@
           <w:b w:val="0"/>
           <w:sz w:val="22"/>
         </w:rPr>
-        <w:t>Anexo No. 2. Encuesta a estudiantes y egresados.</w:t>
+        <w:t>Anexo 2. Encuesta a estudiantes y egresados y resultados.</w:t>
       </w:r>
     </w:p>
     <w:p>
@@ -3290,7 +3394,7 @@
           <w:b w:val="0"/>
           <w:sz w:val="22"/>
         </w:rPr>
-        <w:t>Anexo No. 3. Encuesta a docentes.</w:t>
+        <w:t>Anexo 3. Encuesta a docentes y resultados.</w:t>
       </w:r>
     </w:p>
     <w:p>
@@ -3305,7 +3409,52 @@
           <w:b w:val="0"/>
           <w:sz w:val="22"/>
         </w:rPr>
-        <w:t>Anexo No. 4. Ruta institucional de emprendimiento (documento aparte).</w:t>
+        <w:t>Anexo 4. Análisis DOFA (documento en Word).</w:t>
+      </w:r>
+    </w:p>
+    <w:p>
+      <w:pPr>
+        <w:pStyle w:val="ListBullet"/>
+        <w:spacing w:after="60"/>
+        <w:ind w:left="454"/>
+        <w:jc w:val="both"/>
+      </w:pPr>
+      <w:r>
+        <w:rPr>
+          <w:b w:val="0"/>
+          <w:sz w:val="22"/>
+        </w:rPr>
+        <w:t>Anexo 5. Estrategias de articulación con las facultades (documento en Word).</w:t>
+      </w:r>
+    </w:p>
+    <w:p>
+      <w:pPr>
+        <w:pStyle w:val="ListBullet"/>
+        <w:spacing w:after="60"/>
+        <w:ind w:left="454"/>
+        <w:jc w:val="both"/>
+      </w:pPr>
+      <w:r>
+        <w:rPr>
+          <w:b w:val="0"/>
+          <w:sz w:val="22"/>
+        </w:rPr>
+        <w:t>Anexo 6. Documento técnico de la ruta institucional de emprendimiento (Word).</w:t>
+      </w:r>
+    </w:p>
+    <w:p>
+      <w:pPr>
+        <w:pStyle w:val="ListBullet"/>
+        <w:spacing w:after="60"/>
+        <w:ind w:left="454"/>
+        <w:jc w:val="both"/>
+      </w:pPr>
+      <w:r>
+        <w:rPr>
+          <w:b w:val="0"/>
+          <w:sz w:val="22"/>
+        </w:rPr>
+        <w:t>Anexo 7. Guía visual de la ruta institucional de emprendimiento (PowerPoint).</w:t>
       </w:r>
     </w:p>
     <w:sectPr>

</xml_diff>

<commit_message>
Restaura figura de ubicacion del CIE (Fig 2), renumera figuras 1-11 y amplia menciones de anexos
</commit_message>
<xml_diff>
--- a/Informe-Final-Practica-CIE.docx
+++ b/Informe-Final-Practica-CIE.docx
@@ -788,7 +788,86 @@
           <w:b w:val="0"/>
           <w:i w:val="0"/>
         </w:rPr>
-        <w:t>El diseño de una ruta pertinente exige, en primer lugar, comprender cómo percibe la comunidad universitaria el emprendimiento y al propio CIE. Medir la percepción es importante porque permite conocer la brecha entre la oferta institucional y su apropiación real: revela qué tan visible es el Centro, qué barreras encuentran las personas para acercarse y qué esperan del acompañamiento. Sin este diagnóstico, cualquier ruta correría el riesgo de responder a supuestos y no a necesidades reales. Con ese propósito se aplicó una encuesta a estudiantes y egresados (n=106), que evidenció una brecha significativa: pese a que el 87,7 % manifiesta algún grado de interés o actividad emprendedora, el 67 % declara conocer poco o nada el CIE (Figura 2). Esta baja apropiación coincide con lo planteado por Saavedra-García et al. (2025) sobre la necesidad de potenciar la intención emprendedora mediante estrategias y seguimiento claros.</w:t>
+        <w:t>De manera específica, dentro de esa estructura el CIE se ubica en el Departamento de Extensión y Proyección Social, adscrito a la Vicerrectoría de Investigaciones, Extensión y Proyección Social; la Figura 2 presenta esa ubicación institucional y el lugar que ocupa la ruta de emprendimiento dentro de la Universidad.</w:t>
+      </w:r>
+    </w:p>
+    <w:p>
+      <w:pPr>
+        <w:jc w:val="center"/>
+      </w:pPr>
+      <w:r>
+        <w:drawing>
+          <wp:inline xmlns:a="http://schemas.openxmlformats.org/drawingml/2006/main" xmlns:pic="http://schemas.openxmlformats.org/drawingml/2006/picture">
+            <wp:extent cx="4389120" cy="2722366"/>
+            <wp:docPr id="2" name="Picture 2"/>
+            <wp:cNvGraphicFramePr>
+              <a:graphicFrameLocks noChangeAspect="1"/>
+            </wp:cNvGraphicFramePr>
+            <a:graphic>
+              <a:graphicData uri="http://schemas.openxmlformats.org/drawingml/2006/picture">
+                <pic:pic>
+                  <pic:nvPicPr>
+                    <pic:cNvPr id="0" name="organigrama.png"/>
+                    <pic:cNvPicPr/>
+                  </pic:nvPicPr>
+                  <pic:blipFill>
+                    <a:blip r:embed="rId11"/>
+                    <a:stretch>
+                      <a:fillRect/>
+                    </a:stretch>
+                  </pic:blipFill>
+                  <pic:spPr>
+                    <a:xfrm>
+                      <a:off x="0" y="0"/>
+                      <a:ext cx="4389120" cy="2722366"/>
+                    </a:xfrm>
+                    <a:prstGeom prst="rect"/>
+                  </pic:spPr>
+                </pic:pic>
+              </a:graphicData>
+            </a:graphic>
+          </wp:inline>
+        </w:drawing>
+      </w:r>
+    </w:p>
+    <w:p>
+      <w:pPr>
+        <w:spacing w:after="200"/>
+        <w:jc w:val="center"/>
+      </w:pPr>
+      <w:r>
+        <w:rPr>
+          <w:i/>
+          <w:color w:val="595959"/>
+          <w:sz w:val="18"/>
+        </w:rPr>
+        <w:t xml:space="preserve">Figura </w:t>
+      </w:r>
+      <w:fldSimple w:instr=" SEQ Figura \* ARABIC ">
+        <w:r>
+          <w:t>1</w:t>
+        </w:r>
+      </w:fldSimple>
+      <w:r>
+        <w:rPr>
+          <w:i/>
+          <w:color w:val="595959"/>
+          <w:sz w:val="18"/>
+        </w:rPr>
+        <w:t>. Ubicación institucional del CIE y de la ruta de emprendimiento. Elaboración propia a partir del PDI 2022-2031 (Universidad del Atlántico, 2022).</w:t>
+      </w:r>
+    </w:p>
+    <w:p>
+      <w:pPr>
+        <w:spacing w:after="120" w:before="0"/>
+        <w:jc w:val="both"/>
+      </w:pPr>
+      <w:r>
+        <w:rPr>
+          <w:b w:val="0"/>
+          <w:i w:val="0"/>
+        </w:rPr>
+        <w:t>El diseño de una ruta pertinente exige, en primer lugar, comprender cómo percibe la comunidad universitaria el emprendimiento y al propio CIE. Medir la percepción es importante porque permite conocer la brecha entre la oferta institucional y su apropiación real: revela qué tan visible es el Centro, qué barreras encuentran las personas para acercarse y qué esperan del acompañamiento. Sin este diagnóstico, cualquier ruta correría el riesgo de responder a supuestos y no a necesidades reales. Con ese propósito se aplicó una encuesta a estudiantes y egresados (n=106), cuyos resultados completos se recogen en el Anexo 2, y que evidenció una brecha significativa: pese a que el 87,7 % manifiesta algún grado de interés o actividad emprendedora, el 67 % declara conocer poco o nada el CIE (Figura 3). Esta baja apropiación coincide con lo planteado por Saavedra-García et al. (2025) sobre la necesidad de potenciar la intención emprendedora mediante estrategias y seguimiento claros.</w:t>
       </w:r>
     </w:p>
     <w:p>
@@ -799,7 +878,7 @@
         <w:drawing>
           <wp:inline xmlns:a="http://schemas.openxmlformats.org/drawingml/2006/main" xmlns:pic="http://schemas.openxmlformats.org/drawingml/2006/picture">
             <wp:extent cx="4206240" cy="2421919"/>
-            <wp:docPr id="2" name="Picture 2"/>
+            <wp:docPr id="3" name="Picture 3"/>
             <wp:cNvGraphicFramePr>
               <a:graphicFrameLocks noChangeAspect="1"/>
             </wp:cNvGraphicFramePr>
@@ -811,7 +890,7 @@
                     <pic:cNvPicPr/>
                   </pic:nvPicPr>
                   <pic:blipFill>
-                    <a:blip r:embed="rId11"/>
+                    <a:blip r:embed="rId12"/>
                     <a:stretch>
                       <a:fillRect/>
                     </a:stretch>
@@ -867,7 +946,7 @@
           <w:b w:val="0"/>
           <w:i w:val="0"/>
         </w:rPr>
-        <w:t>La percepción estudiantil se complementó con una consulta a docentes (n=10). A diferencia de la encuesta a estudiantes, esta fue deliberadamente específica y dirigida: se aplicó principalmente a profesores de la Facultad de Ciencias Económicas que ya venían adelantando trabajos y procesos relacionados con el emprendimiento. Se optó por esta focalización porque el objetivo no era obtener una muestra general, sino una lectura cualificada por parte de actores con conocimiento directo del tema y de la relación entre las facultades y el CIE. El resultado fue contundente: los docentes señalaron la débil articulación entre las facultades y el CIE como la principal dificultad para fortalecer el emprendimiento (60 %) (Figura 3), lo que confirma —desde la mirada docente— uno de los factores más críticos del problema.</w:t>
+        <w:t>La percepción estudiantil se complementó con una consulta a docentes (n=10), cuyos resultados se detallan en el Anexo 3. A diferencia de la encuesta a estudiantes, esta fue deliberadamente específica y dirigida: se aplicó principalmente a profesores de la Facultad de Ciencias Económicas que ya venían adelantando trabajos y procesos relacionados con el emprendimiento. Se optó por esta focalización porque el objetivo no era obtener una muestra general, sino una lectura cualificada por parte de actores con conocimiento directo del tema y de la relación entre las facultades y el CIE. El resultado fue contundente: los docentes señalaron la débil articulación entre las facultades y el CIE como la principal dificultad para fortalecer el emprendimiento (60 %) (Figura 4), lo que confirma —desde la mirada docente— uno de los factores más críticos del problema.</w:t>
       </w:r>
     </w:p>
     <w:p>
@@ -878,7 +957,7 @@
         <w:drawing>
           <wp:inline xmlns:a="http://schemas.openxmlformats.org/drawingml/2006/main" xmlns:pic="http://schemas.openxmlformats.org/drawingml/2006/picture">
             <wp:extent cx="4937760" cy="2516142"/>
-            <wp:docPr id="3" name="Picture 3"/>
+            <wp:docPr id="4" name="Picture 4"/>
             <wp:cNvGraphicFramePr>
               <a:graphicFrameLocks noChangeAspect="1"/>
             </wp:cNvGraphicFramePr>
@@ -890,7 +969,7 @@
                     <pic:cNvPicPr/>
                   </pic:nvPicPr>
                   <pic:blipFill>
-                    <a:blip r:embed="rId12"/>
+                    <a:blip r:embed="rId13"/>
                     <a:stretch>
                       <a:fillRect/>
                     </a:stretch>
@@ -1053,7 +1132,7 @@
           <w:b w:val="0"/>
           <w:i w:val="0"/>
         </w:rPr>
-        <w:t>El diagnóstico combinó consultas a actores y dos encuestas. La ficha técnica se presenta en la Tabla 2.</w:t>
+        <w:t>El diagnóstico combinó consultas a actores y dos encuestas. La ficha técnica se presenta en la Tabla 2; los instrumentos aplicados y sus resultados completos se incorporan como anexos: las entrevistas y guías de consulta (Anexo 1), la encuesta a estudiantes y egresados con sus resultados (Anexo 2) y la encuesta a docentes con sus resultados (Anexo 3).</w:t>
       </w:r>
     </w:p>
     <w:p>
@@ -1287,7 +1366,7 @@
           <w:b w:val="0"/>
           <w:i w:val="0"/>
         </w:rPr>
-        <w:t>De acuerdo con la consulta interna, el CIE ofrece capacitaciones, asesorías, talleres de ideación, validación de modelos de negocio, eventos de innovación y convocatorias, y reconoce como fortalezas el talento humano, la experiencia en acompañamiento y la cercanía con los estudiantes. No obstante, admite que no existe una ruta estructurada que estandarice etapas, roles, servicios y tiempos, y señala limitaciones de recursos, visibilidad y continuidad. Esta lectura es coherente con la baja apropiación estudiantil evidenciada en la encuesta.</w:t>
+        <w:t>De acuerdo con la consulta interna realizada al propio CIE (Anexo 1), este ofrece capacitaciones, asesorías, talleres de ideación, validación de modelos de negocio, eventos de innovación y convocatorias, y reconoce como fortalezas el talento humano, la experiencia en acompañamiento y la cercanía con los estudiantes. No obstante, admite que no existe una ruta estructurada que estandarice etapas, roles, servicios y tiempos, y señala limitaciones de recursos, visibilidad y continuidad. Esta lectura es coherente con la baja apropiación estudiantil evidenciada en la encuesta.</w:t>
       </w:r>
     </w:p>
     <w:p>
@@ -1313,7 +1392,7 @@
           <w:b w:val="0"/>
           <w:i w:val="0"/>
         </w:rPr>
-        <w:t>En primer lugar, respecto a la situación emprendedora de los encuestados, el 46,2 % manifiesta interés en emprender aunque todavía no tiene una idea definida, el 26,4 % ya cuenta con una idea, el 15,1 % tiene un emprendimiento en marcha y solo el 12,3 % declara no tener interés (Figura 4). Esto revela que la gran mayoría de la comunidad estudiantil se encuentra en etapas tempranas del proceso emprendedor —justamente donde el acompañamiento del CIE resulta más determinante—.</w:t>
+        <w:t>En primer lugar, respecto a la situación emprendedora de los encuestados, el 46,2 % manifiesta interés en emprender aunque todavía no tiene una idea definida, el 26,4 % ya cuenta con una idea, el 15,1 % tiene un emprendimiento en marcha y solo el 12,3 % declara no tener interés (Figura 5). Esto revela que la gran mayoría de la comunidad estudiantil se encuentra en etapas tempranas del proceso emprendedor —justamente donde el acompañamiento del CIE resulta más determinante—.</w:t>
       </w:r>
     </w:p>
     <w:p>
@@ -1324,7 +1403,7 @@
         <w:drawing>
           <wp:inline xmlns:a="http://schemas.openxmlformats.org/drawingml/2006/main" xmlns:pic="http://schemas.openxmlformats.org/drawingml/2006/picture">
             <wp:extent cx="4572000" cy="2868503"/>
-            <wp:docPr id="4" name="Picture 4"/>
+            <wp:docPr id="5" name="Picture 5"/>
             <wp:cNvGraphicFramePr>
               <a:graphicFrameLocks noChangeAspect="1"/>
             </wp:cNvGraphicFramePr>
@@ -1336,7 +1415,7 @@
                     <pic:cNvPicPr/>
                   </pic:nvPicPr>
                   <pic:blipFill>
-                    <a:blip r:embed="rId13"/>
+                    <a:blip r:embed="rId14"/>
                     <a:stretch>
                       <a:fillRect/>
                     </a:stretch>
@@ -1392,7 +1471,7 @@
           <w:b w:val="0"/>
           <w:i w:val="0"/>
         </w:rPr>
-        <w:t>En cuanto a las actitudes hacia el emprendimiento, las afirmaciones valorativas reflejan una disposición favorable: la idea del emprendimiento como una opción real de desarrollo profesional alcanzó un promedio de 4,26/5, uno de los valores más altos de la encuesta (Figura 5). Existe, por tanto, una base actitudinal positiva sobre la cual construir la ruta.</w:t>
+        <w:t>En cuanto a las actitudes hacia el emprendimiento, las afirmaciones valorativas reflejan una disposición favorable: la idea del emprendimiento como una opción real de desarrollo profesional alcanzó un promedio de 4,26/5, uno de los valores más altos de la encuesta (Figura 6). Existe, por tanto, una base actitudinal positiva sobre la cual construir la ruta.</w:t>
       </w:r>
     </w:p>
     <w:p>
@@ -1403,7 +1482,7 @@
         <w:drawing>
           <wp:inline xmlns:a="http://schemas.openxmlformats.org/drawingml/2006/main" xmlns:pic="http://schemas.openxmlformats.org/drawingml/2006/picture">
             <wp:extent cx="4754880" cy="2352025"/>
-            <wp:docPr id="5" name="Picture 5"/>
+            <wp:docPr id="6" name="Picture 6"/>
             <wp:cNvGraphicFramePr>
               <a:graphicFrameLocks noChangeAspect="1"/>
             </wp:cNvGraphicFramePr>
@@ -1415,7 +1494,7 @@
                     <pic:cNvPicPr/>
                   </pic:nvPicPr>
                   <pic:blipFill>
-                    <a:blip r:embed="rId14"/>
+                    <a:blip r:embed="rId15"/>
                     <a:stretch>
                       <a:fillRect/>
                     </a:stretch>
@@ -1471,7 +1550,7 @@
           <w:b w:val="0"/>
           <w:i w:val="0"/>
         </w:rPr>
-        <w:t>No obstante, ese interés no se traduce en un acercamiento al Centro. La principal razón para no aproximarse al CIE es el desconocimiento de los servicios que ofrece, seguida de no saber cómo acceder a ellos (Figura 6). La barrera, por tanto, no es de motivación sino de información y visibilidad, lo que refuerza el diagnóstico del problema.</w:t>
+        <w:t>No obstante, ese interés no se traduce en un acercamiento al Centro. La principal razón para no aproximarse al CIE es el desconocimiento de los servicios que ofrece, seguida de no saber cómo acceder a ellos (Figura 7). La barrera, por tanto, no es de motivación sino de información y visibilidad, lo que refuerza el diagnóstico del problema.</w:t>
       </w:r>
     </w:p>
     <w:p>
@@ -1482,7 +1561,7 @@
         <w:drawing>
           <wp:inline xmlns:a="http://schemas.openxmlformats.org/drawingml/2006/main" xmlns:pic="http://schemas.openxmlformats.org/drawingml/2006/picture">
             <wp:extent cx="4937760" cy="2791531"/>
-            <wp:docPr id="6" name="Picture 6"/>
+            <wp:docPr id="7" name="Picture 7"/>
             <wp:cNvGraphicFramePr>
               <a:graphicFrameLocks noChangeAspect="1"/>
             </wp:cNvGraphicFramePr>
@@ -1494,7 +1573,7 @@
                     <pic:cNvPicPr/>
                   </pic:nvPicPr>
                   <pic:blipFill>
-                    <a:blip r:embed="rId15"/>
+                    <a:blip r:embed="rId16"/>
                     <a:stretch>
                       <a:fillRect/>
                     </a:stretch>
@@ -1550,7 +1629,7 @@
           <w:b w:val="0"/>
           <w:i w:val="0"/>
         </w:rPr>
-        <w:t>Respecto a la demanda de acompañamiento, los apoyos más solicitados por los estudiantes son la asesoría en modelo de negocio (62,3 %), la educación financiera (50 %) y el marketing (49,1 %) (Figura 7). Estas necesidades constituyen insumos directos para definir los contenidos de las fases de formación y preincubación de la ruta.</w:t>
+        <w:t>Respecto a la demanda de acompañamiento, los apoyos más solicitados por los estudiantes son la asesoría en modelo de negocio (62,3 %), la educación financiera (50 %) y el marketing (49,1 %) (Figura 8). Estas necesidades constituyen insumos directos para definir los contenidos de las fases de formación y preincubación de la ruta.</w:t>
       </w:r>
     </w:p>
     <w:p>
@@ -1561,7 +1640,7 @@
         <w:drawing>
           <wp:inline xmlns:a="http://schemas.openxmlformats.org/drawingml/2006/main" xmlns:pic="http://schemas.openxmlformats.org/drawingml/2006/picture">
             <wp:extent cx="4937760" cy="2805109"/>
-            <wp:docPr id="7" name="Picture 7"/>
+            <wp:docPr id="8" name="Picture 8"/>
             <wp:cNvGraphicFramePr>
               <a:graphicFrameLocks noChangeAspect="1"/>
             </wp:cNvGraphicFramePr>
@@ -1573,7 +1652,7 @@
                     <pic:cNvPicPr/>
                   </pic:nvPicPr>
                   <pic:blipFill>
-                    <a:blip r:embed="rId16"/>
+                    <a:blip r:embed="rId17"/>
                     <a:stretch>
                       <a:fillRect/>
                     </a:stretch>
@@ -1629,7 +1708,7 @@
           <w:b w:val="0"/>
           <w:i w:val="0"/>
         </w:rPr>
-        <w:t>Finalmente, en cuanto a los canales de comunicación, los medios preferidos para recibir información son el correo institucional y WhatsApp (Figura 8). Este dato es clave para diseñar la estrategia de difusión, que deberá priorizar dichos canales para superar la baja visibilidad detectada.</w:t>
+        <w:t>Finalmente, en cuanto a los canales de comunicación, los medios preferidos para recibir información son el correo institucional y WhatsApp (Figura 9). Este dato es clave para diseñar la estrategia de difusión, que deberá priorizar dichos canales para superar la baja visibilidad detectada.</w:t>
       </w:r>
     </w:p>
     <w:p>
@@ -1640,7 +1719,7 @@
         <w:drawing>
           <wp:inline xmlns:a="http://schemas.openxmlformats.org/drawingml/2006/main" xmlns:pic="http://schemas.openxmlformats.org/drawingml/2006/picture">
             <wp:extent cx="4572000" cy="2645303"/>
-            <wp:docPr id="8" name="Picture 8"/>
+            <wp:docPr id="9" name="Picture 9"/>
             <wp:cNvGraphicFramePr>
               <a:graphicFrameLocks noChangeAspect="1"/>
             </wp:cNvGraphicFramePr>
@@ -1652,7 +1731,7 @@
                     <pic:cNvPicPr/>
                   </pic:nvPicPr>
                   <pic:blipFill>
-                    <a:blip r:embed="rId17"/>
+                    <a:blip r:embed="rId18"/>
                     <a:stretch>
                       <a:fillRect/>
                     </a:stretch>
@@ -1708,7 +1787,7 @@
           <w:b w:val="0"/>
           <w:i w:val="0"/>
         </w:rPr>
-        <w:t>La consulta a docentes (n=10) reforzó el diagnóstico. Además de la débil articulación ya señalada (Figura 3), la afirmación mejor valorada por los docentes fue que la creación de una ruta institucional fortalecería el ecosistema emprendedor, con 4,2/5 —el promedio más alto de su encuesta— (Figura 9). De este modo, los docentes no solo reconocen el problema, sino que avalan directamente la solución propuesta. A ello se suma que un referente externo, la Corporación MAVI, demuestra que una ruta por etapas en operación es viable y efectiva.</w:t>
+        <w:t>La consulta a docentes (n=10) reforzó el diagnóstico. Además de la débil articulación ya señalada (Figura 4), la afirmación mejor valorada por los docentes fue que la creación de una ruta institucional fortalecería el ecosistema emprendedor, con 4,2/5 —el promedio más alto de su encuesta— (Figura 10). De este modo, los docentes no solo reconocen el problema, sino que avalan directamente la solución propuesta. A ello se suma que un referente externo, la Corporación MAVI (Anexo 1), demuestra que una ruta por etapas en operación es viable y efectiva.</w:t>
       </w:r>
     </w:p>
     <w:p>
@@ -1719,7 +1798,7 @@
         <w:drawing>
           <wp:inline xmlns:a="http://schemas.openxmlformats.org/drawingml/2006/main" xmlns:pic="http://schemas.openxmlformats.org/drawingml/2006/picture">
             <wp:extent cx="4937760" cy="2520738"/>
-            <wp:docPr id="9" name="Picture 9"/>
+            <wp:docPr id="10" name="Picture 10"/>
             <wp:cNvGraphicFramePr>
               <a:graphicFrameLocks noChangeAspect="1"/>
             </wp:cNvGraphicFramePr>
@@ -1731,7 +1810,7 @@
                     <pic:cNvPicPr/>
                   </pic:nvPicPr>
                   <pic:blipFill>
-                    <a:blip r:embed="rId18"/>
+                    <a:blip r:embed="rId19"/>
                     <a:stretch>
                       <a:fillRect/>
                     </a:stretch>
@@ -2209,7 +2288,7 @@
           <w:b w:val="0"/>
           <w:i w:val="0"/>
         </w:rPr>
-        <w:t xml:space="preserve">La implementación de la ruta enfrenta retos identificados en las consultas y encuestas: asegurar los </w:t>
+        <w:t xml:space="preserve">La implementación de la ruta enfrenta retos identificados en las consultas y encuestas (Anexos 1 a 3): asegurar los </w:t>
       </w:r>
       <w:r>
         <w:rPr>
@@ -2300,7 +2379,7 @@
           <w:b w:val="0"/>
           <w:i w:val="0"/>
         </w:rPr>
-        <w:t>La ruta se compone de seis fases secuenciales, organizadas por nivel de madurez, y de tres componentes transversales que acompañan todas las fases: T1. comunicación; T2. seguimiento e indicadores; y T3. articulación con las facultades. Su carácter no lineal permite que cada iniciativa ingrese en la fase correspondiente a su estado, siguiendo la lógica de referentes como MacondoLab (MacondoLab, s.f.) y la Universidad de los Andes (Universidad de los Andes, s.f.). La Figura 10 presenta el esquema general. Para su construcción se realizó un levantamiento de información con instituciones que promueven el emprendimiento y un análisis en detalle de cada fase, con sus responsables e indicadores, que se desarrolla en el documento técnico de la ruta (Anexo 6).</w:t>
+        <w:t>La ruta se compone de seis fases secuenciales, organizadas por nivel de madurez, y de tres componentes transversales que acompañan todas las fases: T1. comunicación; T2. seguimiento e indicadores; y T3. articulación con las facultades. Su carácter no lineal permite que cada iniciativa ingrese en la fase correspondiente a su estado, siguiendo la lógica de referentes como MacondoLab (MacondoLab, s.f.) y la Universidad de los Andes (Universidad de los Andes, s.f.). La Figura 11 presenta el esquema general. Para su construcción se realizó un levantamiento de información con instituciones que promueven el emprendimiento y un análisis en detalle de cada fase, con sus responsables e indicadores, que se desarrolla en el documento técnico de la ruta (Anexo 6).</w:t>
       </w:r>
     </w:p>
     <w:p>
@@ -2311,7 +2390,7 @@
         <w:drawing>
           <wp:inline xmlns:a="http://schemas.openxmlformats.org/drawingml/2006/main" xmlns:pic="http://schemas.openxmlformats.org/drawingml/2006/picture">
             <wp:extent cx="5852160" cy="3271372"/>
-            <wp:docPr id="10" name="Picture 10"/>
+            <wp:docPr id="11" name="Picture 11"/>
             <wp:cNvGraphicFramePr>
               <a:graphicFrameLocks noChangeAspect="1"/>
             </wp:cNvGraphicFramePr>
@@ -2323,7 +2402,7 @@
                     <pic:cNvPicPr/>
                   </pic:nvPicPr>
                   <pic:blipFill>
-                    <a:blip r:embed="rId19"/>
+                    <a:blip r:embed="rId20"/>
                     <a:stretch>
                       <a:fillRect/>
                     </a:stretch>

</xml_diff>

<commit_message>
Alinea con el PDI real: Linea Estrategica 3 y sus motores; corrige meta de spin-off (RSU) en ruta e informe
</commit_message>
<xml_diff>
--- a/Informe-Final-Practica-CIE.docx
+++ b/Informe-Final-Practica-CIE.docx
@@ -666,7 +666,7 @@
           <w:b w:val="0"/>
           <w:i w:val="0"/>
         </w:rPr>
-        <w:t>El PDI fija además metas concretas: formular e implementar la política de innovación, emprendimiento y transferencia tecnológica; crear el Centro de Emprendimiento «UA Emprende» —denominación institucional del actual CIE— y garantizar la sostenibilidad de al menos el 3 % de los proyectos acompañados; desarrollar dos spin-off desde los laboratorios de investigación; y operacionalizar el Parque Tecnológico del Caribe integrando el ecosistema regional de ciencia, tecnología e innovación (Universidad del Atlántico, 2022). En consecuencia, la ruta propuesta se constituye en el brazo operativo de estas metas institucionales.</w:t>
+        <w:t>El PDI fija además metas concretas: formular e implementar la política de innovación, emprendimiento y transferencia tecnológica; crear el Centro de Emprendimiento «UA Emprende» —denominación institucional del actual CIE— y garantizar la sostenibilidad de al menos el 3 % de los proyectos acompañados; promover la comercialización de al menos dos proyectos que generen spin-off (en el marco de la Responsabilidad Social Universitaria); e incrementar los ingresos del Centro de Investigaciones Científicas y Tecnológicas (CICIT) y del Parque Tecnológico del Caribe (Universidad del Atlántico, 2022). En consecuencia, la ruta propuesta se constituye en el brazo operativo de estas metas institucionales.</w:t>
       </w:r>
     </w:p>
     <w:p>
@@ -775,7 +775,7 @@
           <w:b w:val="0"/>
           <w:i w:val="0"/>
         </w:rPr>
-        <w:t>El Centro de Innovación y Emprendimiento es una unidad de creación reciente dentro de la Universidad. Su surgimiento y consolidación responden al mandato del Plan de Desarrollo Institucional 2022–2031, que ordena crear y fortalecer el ecosistema de innovación y emprendimiento —bajo la iniciativa institucional «UA Emprende»—, así como a la reestructuración orgánica de la institución (Universidad del Atlántico, 2022). Por su corta trayectoria, el CIE se encuentra aún en una etapa de estructuración de sus procesos y servicios, lo que explica tanto su gran potencial como los retos de visibilidad, articulación y consolidación que este trabajo busca atender.</w:t>
+        <w:t>El Centro de Innovación y Emprendimiento es una unidad de creación reciente dentro de la Universidad. Su surgimiento y consolidación responden al mandato del Plan de Desarrollo Institucional 2022–2031, que ordena crear y fortalecer el ecosistema de innovación y emprendimiento, así como a la reestructuración orgánica de la institución (Universidad del Atlántico, 2022). Por su corta trayectoria, el CIE se encuentra aún en una etapa de estructuración de sus procesos y servicios, lo que explica tanto su gran potencial como los retos de visibilidad, articulación y consolidación que este trabajo busca atender. Para comprender el funcionamiento actual del Centro se realizó, además, una consulta a un funcionario del CIE, cuyas respuestas se recogen en el Anexo 1 y sirvieron de base para caracterizar sus servicios, fortalezas y limitaciones.</w:t>
       </w:r>
     </w:p>
     <w:p>
@@ -2379,7 +2379,7 @@
           <w:b w:val="0"/>
           <w:i w:val="0"/>
         </w:rPr>
-        <w:t>La ruta se compone de seis fases secuenciales, organizadas por nivel de madurez, y de tres componentes transversales que acompañan todas las fases: T1. comunicación; T2. seguimiento e indicadores; y T3. articulación con las facultades. Su carácter no lineal permite que cada iniciativa ingrese en la fase correspondiente a su estado, siguiendo la lógica de referentes como MacondoLab (MacondoLab, s.f.) y la Universidad de los Andes (Universidad de los Andes, s.f.). La Figura 11 presenta el esquema general. Para su construcción se realizó un levantamiento de información con instituciones que promueven el emprendimiento y un análisis en detalle de cada fase, con sus responsables e indicadores, que se desarrolla en el documento técnico de la ruta (Anexo 6).</w:t>
+        <w:t>La ruta se compone de seis fases secuenciales, organizadas por nivel de madurez, y de tres componentes transversales que acompañan todas las fases: T1. comunicación; T2. seguimiento e indicadores; y T3. articulación con las facultades. Su carácter no lineal permite que cada iniciativa ingrese en la fase correspondiente a su estado, siguiendo la lógica de referentes como MacondoLab (MacondoLab, s.f.) y la Universidad de los Andes (Universidad de los Andes, s.f.). La Figura 11 presenta el esquema general. Para su construcción se realizó un levantamiento de información con instituciones que promueven el emprendimiento y un análisis en detalle de cada fase, con sus responsables e indicadores, que se desarrolla en el documento técnico de la ruta (Anexo 5).</w:t>
       </w:r>
     </w:p>
     <w:p>
@@ -2542,7 +2542,7 @@
           <w:b w:val="0"/>
           <w:i w:val="0"/>
         </w:rPr>
-        <w:t>, que conecta con convocatorias, capital semilla, propiedad intelectual y aliados como Cientech y el Parque Tecnológico del Caribe. Este contenido se presenta además de forma visual, como instrumento facilitador para la socialización de la ruta, en la guía en formato de presentación que se adjunta como Anexo 7.</w:t>
+        <w:t>, que conecta con convocatorias, capital semilla, propiedad intelectual y aliados como Cientech y el Parque Tecnológico del Caribe. Este contenido se presenta además de forma visual, como instrumento facilitador para la socialización de la ruta, en la guía en formato de presentación que se adjunta como Anexo 6.</w:t>
       </w:r>
     </w:p>
     <w:p>
@@ -2555,7 +2555,7 @@
           <w:b w:val="0"/>
           <w:i w:val="0"/>
         </w:rPr>
-        <w:t>Ahora bien, para que la ruta impacte a toda la comunidad, su implementación se sustenta en un conjunto de estrategias de articulación con las facultades, desarrolladas en detalle en un documento independiente (Anexo 5). Dicha articulación se materializa a través de un docente enlace en cada facultad, la integración curricular progresiva del emprendimiento, la realización de actividades y eventos conjuntos por facultad, y una difusión segmentada por los canales preferidos por la comunidad (correo institucional y WhatsApp), atendiendo las preferencias evidenciadas en el diagnóstico. De este modo, la ruta y las estrategias de articulación operan de forma complementaria: la primera define el «qué» y el «cómo» del acompañamiento, y las segundas aseguran que ese acompañamiento llegue de manera transversal a todas las facultades.</w:t>
+        <w:t>Ahora bien, para que la ruta impacte a toda la comunidad, su implementación se sustenta en un conjunto de estrategias de articulación con las facultades, desarrolladas en detalle en un documento independiente (Anexo 7). Dicha articulación se materializa a través de un docente enlace en cada facultad, la integración curricular progresiva del emprendimiento, la realización de actividades y eventos conjuntos por facultad, y una difusión segmentada por los canales preferidos por la comunidad (correo institucional y WhatsApp), atendiendo las preferencias evidenciadas en el diagnóstico. De este modo, la ruta y las estrategias de articulación operan de forma complementaria: la primera define el «qué» y el «cómo» del acompañamiento, y las segundas aseguran que ese acompañamiento llegue de manera transversal a todas las facultades.</w:t>
       </w:r>
     </w:p>
     <w:p>
@@ -3503,7 +3503,7 @@
           <w:b w:val="0"/>
           <w:sz w:val="22"/>
         </w:rPr>
-        <w:t>Anexo 5. Estrategias de articulación con las facultades (documento en Word).</w:t>
+        <w:t>Anexo 5. Documento técnico de la ruta institucional de emprendimiento (Word).</w:t>
       </w:r>
     </w:p>
     <w:p>
@@ -3518,7 +3518,7 @@
           <w:b w:val="0"/>
           <w:sz w:val="22"/>
         </w:rPr>
-        <w:t>Anexo 6. Documento técnico de la ruta institucional de emprendimiento (Word).</w:t>
+        <w:t>Anexo 6. Guía visual de la ruta institucional de emprendimiento (PowerPoint).</w:t>
       </w:r>
     </w:p>
     <w:p>
@@ -3533,7 +3533,7 @@
           <w:b w:val="0"/>
           <w:sz w:val="22"/>
         </w:rPr>
-        <w:t>Anexo 7. Guía visual de la ruta institucional de emprendimiento (PowerPoint).</w:t>
+        <w:t>Anexo 7. Estrategias de articulación con las facultades (documento en Word).</w:t>
       </w:r>
     </w:p>
     <w:sectPr>

</xml_diff>